<commit_message>
regulei os template que lucas pediu, e adicionei o pix no schedule
</commit_message>
<xml_diff>
--- a/resources/templates/autodeclaracao.docx
+++ b/resources/templates/autodeclaracao.docx
@@ -193,7 +193,7 @@
             <v:stroke joinstyle="miter"/>
             <v:path gradientshapeok="t" o:connecttype="rect"/>
           </v:shapetype>
-          <v:shape id="_x0000_s2057" type="#_x0000_t202" style="position:absolute;left:0;text-align:left;margin-left:31.65pt;margin-top:7.15pt;width:187.05pt;height:18.65pt;z-index:251660800;mso-width-percent:400;mso-width-percent:400;mso-width-relative:margin;mso-height-relative:margin" stroked="f" strokeweight="0">
+          <v:shape id="_x0000_s2057" type="#_x0000_t202" style="position:absolute;left:0;text-align:left;margin-left:29.7pt;margin-top:6.4pt;width:186.65pt;height:18.65pt;z-index:251660800;mso-width-percent:400;mso-width-percent:400;mso-width-relative:margin;mso-height-relative:margin" stroked="f" strokeweight="0">
             <v:fill opacity="0"/>
             <v:stroke dashstyle="1 1" endcap="round"/>
             <v:textbox style="mso-next-textbox:#_x0000_s2057">
@@ -239,7 +239,7 @@
           <w:lang w:eastAsia="pt-BR"/>
         </w:rPr>
         <w:pict w14:anchorId="7F9F4497">
-          <v:shape id="_x0000_s2051" type="#_x0000_t202" style="position:absolute;left:0;text-align:left;margin-left:112.3pt;margin-top:6.85pt;width:187.05pt;height:18.7pt;z-index:251656704;mso-width-percent:400;mso-width-percent:400;mso-width-relative:margin;mso-height-relative:margin" stroked="f" strokeweight="0">
+          <v:shape id="_x0000_s2051" type="#_x0000_t202" style="position:absolute;left:0;text-align:left;margin-left:109.2pt;margin-top:5.8pt;width:186.55pt;height:18.7pt;z-index:251656704;mso-width-percent:400;mso-width-percent:400;mso-width-relative:margin;mso-height-relative:margin" stroked="f" strokeweight="0">
             <v:fill opacity="0"/>
             <v:stroke dashstyle="1 1" endcap="round"/>
             <v:textbox style="mso-next-textbox:#_x0000_s2051">
@@ -343,7 +343,7 @@
           <w:lang w:eastAsia="pt-BR"/>
         </w:rPr>
         <w:pict w14:anchorId="1C175FDA">
-          <v:shape id="_x0000_s2052" type="#_x0000_t202" style="position:absolute;left:0;text-align:left;margin-left:109.8pt;margin-top:8.3pt;width:186.65pt;height:18.65pt;z-index:251657728;mso-width-percent:400;mso-width-percent:400;mso-width-relative:margin;mso-height-relative:margin" stroked="f" strokeweight="0">
+          <v:shape id="_x0000_s2052" type="#_x0000_t202" style="position:absolute;left:0;text-align:left;margin-left:106.2pt;margin-top:5.95pt;width:186.4pt;height:18.65pt;z-index:251657728;mso-width-percent:400;mso-width-percent:400;mso-width-relative:margin;mso-height-relative:margin" stroked="f" strokeweight="0">
             <v:fill opacity="0"/>
             <v:stroke dashstyle="1 1" endcap="round"/>
             <v:textbox style="mso-next-textbox:#_x0000_s2052">
@@ -425,7 +425,7 @@
           <w:lang w:eastAsia="pt-BR"/>
         </w:rPr>
         <w:pict w14:anchorId="47C4DF93">
-          <v:shape id="_x0000_s2061" type="#_x0000_t202" style="position:absolute;left:0;text-align:left;margin-left:324.35pt;margin-top:4.7pt;width:186.55pt;height:28.7pt;z-index:251662848;mso-width-percent:400;mso-width-percent:400;mso-width-relative:margin;mso-height-relative:margin" stroked="f" strokeweight="0">
+          <v:shape id="_x0000_s2061" type="#_x0000_t202" style="position:absolute;left:0;text-align:left;margin-left:323pt;margin-top:2.3pt;width:186.15pt;height:28.7pt;z-index:251662848;mso-width-percent:400;mso-width-percent:400;mso-width-relative:margin;mso-height-relative:margin" stroked="f" strokeweight="0">
             <v:fill opacity="0"/>
             <v:stroke dashstyle="1 1" endcap="round"/>
             <v:textbox style="mso-next-textbox:#_x0000_s2061" inset=",2.5mm">
@@ -529,7 +529,7 @@
           <w:lang w:eastAsia="pt-BR"/>
         </w:rPr>
         <w:pict w14:anchorId="66C1D8C6">
-          <v:shape id="_x0000_s2053" type="#_x0000_t202" style="position:absolute;left:0;text-align:left;margin-left:18.85pt;margin-top:8.2pt;width:187.05pt;height:22.05pt;z-index:251658752;mso-width-percent:400;mso-width-percent:400;mso-width-relative:margin;mso-height-relative:margin" stroked="f" strokeweight="0">
+          <v:shape id="_x0000_s2053" type="#_x0000_t202" style="position:absolute;left:0;text-align:left;margin-left:11.7pt;margin-top:6.1pt;width:186.15pt;height:22.05pt;z-index:251658752;mso-width-percent:400;mso-width-percent:400;mso-width-relative:margin;mso-height-relative:margin" stroked="f" strokeweight="0">
             <v:fill opacity="0"/>
             <v:stroke dashstyle="1 1" endcap="round"/>
             <v:textbox style="mso-next-textbox:#_x0000_s2053">
@@ -566,7 +566,7 @@
           <w:lang w:eastAsia="pt-BR"/>
         </w:rPr>
         <w:pict w14:anchorId="35A623FC">
-          <v:shape id="_x0000_s2054" type="#_x0000_t202" style="position:absolute;left:0;text-align:left;margin-left:120.35pt;margin-top:8.2pt;width:187.05pt;height:18.7pt;z-index:251659776;mso-width-percent:400;mso-width-percent:400;mso-width-relative:margin;mso-height-relative:margin" stroked="f" strokeweight="0">
+          <v:shape id="_x0000_s2054" type="#_x0000_t202" style="position:absolute;left:0;text-align:left;margin-left:115.2pt;margin-top:6.1pt;width:186.65pt;height:18.7pt;z-index:251659776;mso-width-percent:400;mso-width-percent:400;mso-width-relative:margin;mso-height-relative:margin" stroked="f" strokeweight="0">
             <v:fill opacity="0"/>
             <v:stroke dashstyle="1 1" endcap="round"/>
             <v:textbox style="mso-next-textbox:#_x0000_s2054">
@@ -617,7 +617,7 @@
           <w:lang w:eastAsia="pt-BR"/>
         </w:rPr>
         <w:pict w14:anchorId="41BF3E48">
-          <v:shape id="_x0000_s2060" type="#_x0000_t202" style="position:absolute;left:0;text-align:left;margin-left:75.05pt;margin-top:9.1pt;width:186.65pt;height:18.7pt;z-index:251661824;mso-width-percent:400;mso-width-percent:400;mso-width-relative:margin;mso-height-relative:margin" stroked="f" strokeweight="0">
+          <v:shape id="_x0000_s2060" type="#_x0000_t202" style="position:absolute;left:0;text-align:left;margin-left:68.7pt;margin-top:6.25pt;width:186.6pt;height:18.7pt;z-index:251661824;mso-width-percent:400;mso-width-percent:400;mso-width-relative:margin;mso-height-relative:margin" stroked="f" strokeweight="0">
             <v:fill opacity="0"/>
             <v:stroke dashstyle="1 1" endcap="round"/>
             <v:textbox style="mso-next-textbox:#_x0000_s2060">
@@ -1689,7 +1689,6 @@
               <w:left w:val="single" w:sz="4" w:space="0" w:color="000000"/>
               <w:bottom w:val="single" w:sz="4" w:space="0" w:color="000000"/>
             </w:tcBorders>
-            <w:shd w:val="clear" w:color="auto" w:fill="auto"/>
           </w:tcPr>
           <w:p>
             <w:pPr>
@@ -1826,7 +1825,6 @@
               <w:bottom w:val="single" w:sz="4" w:space="0" w:color="000000"/>
               <w:right w:val="single" w:sz="4" w:space="0" w:color="000000"/>
             </w:tcBorders>
-            <w:shd w:val="clear" w:color="auto" w:fill="auto"/>
           </w:tcPr>
           <w:p>
             <w:pPr>
@@ -1855,7 +1853,6 @@
               <w:left w:val="single" w:sz="4" w:space="0" w:color="000000"/>
               <w:bottom w:val="single" w:sz="4" w:space="0" w:color="000000"/>
             </w:tcBorders>
-            <w:shd w:val="clear" w:color="auto" w:fill="auto"/>
           </w:tcPr>
           <w:p>
             <w:pPr>
@@ -1895,7 +1892,6 @@
               <w:bottom w:val="single" w:sz="4" w:space="0" w:color="000000"/>
               <w:right w:val="single" w:sz="4" w:space="0" w:color="000000"/>
             </w:tcBorders>
-            <w:shd w:val="clear" w:color="auto" w:fill="auto"/>
           </w:tcPr>
           <w:p>
             <w:pPr>
@@ -1921,7 +1917,6 @@
               <w:left w:val="single" w:sz="4" w:space="0" w:color="000000"/>
               <w:bottom w:val="single" w:sz="4" w:space="0" w:color="000000"/>
             </w:tcBorders>
-            <w:shd w:val="clear" w:color="auto" w:fill="auto"/>
           </w:tcPr>
           <w:p>
             <w:pPr>
@@ -1946,7 +1941,6 @@
               <w:bottom w:val="single" w:sz="4" w:space="0" w:color="000000"/>
               <w:right w:val="single" w:sz="4" w:space="0" w:color="000000"/>
             </w:tcBorders>
-            <w:shd w:val="clear" w:color="auto" w:fill="auto"/>
           </w:tcPr>
           <w:p>
             <w:pPr>
@@ -1972,7 +1966,6 @@
               <w:left w:val="single" w:sz="4" w:space="0" w:color="000000"/>
               <w:bottom w:val="single" w:sz="4" w:space="0" w:color="000000"/>
             </w:tcBorders>
-            <w:shd w:val="clear" w:color="auto" w:fill="auto"/>
           </w:tcPr>
           <w:p>
             <w:pPr>
@@ -1997,7 +1990,6 @@
               <w:bottom w:val="single" w:sz="4" w:space="0" w:color="000000"/>
               <w:right w:val="single" w:sz="4" w:space="0" w:color="000000"/>
             </w:tcBorders>
-            <w:shd w:val="clear" w:color="auto" w:fill="auto"/>
           </w:tcPr>
           <w:p>
             <w:pPr>
@@ -2087,7 +2079,6 @@
               <w:left w:val="single" w:sz="4" w:space="0" w:color="000000"/>
               <w:bottom w:val="single" w:sz="4" w:space="0" w:color="000000"/>
             </w:tcBorders>
-            <w:shd w:val="clear" w:color="auto" w:fill="auto"/>
           </w:tcPr>
           <w:p>
             <w:pPr>
@@ -2224,7 +2215,6 @@
               <w:bottom w:val="single" w:sz="4" w:space="0" w:color="000000"/>
               <w:right w:val="single" w:sz="4" w:space="0" w:color="000000"/>
             </w:tcBorders>
-            <w:shd w:val="clear" w:color="auto" w:fill="auto"/>
           </w:tcPr>
           <w:p>
             <w:pPr>
@@ -2253,7 +2243,6 @@
               <w:left w:val="single" w:sz="4" w:space="0" w:color="000000"/>
               <w:bottom w:val="single" w:sz="4" w:space="0" w:color="000000"/>
             </w:tcBorders>
-            <w:shd w:val="clear" w:color="auto" w:fill="auto"/>
           </w:tcPr>
           <w:p>
             <w:pPr>
@@ -2278,7 +2267,6 @@
               <w:bottom w:val="single" w:sz="4" w:space="0" w:color="000000"/>
               <w:right w:val="single" w:sz="4" w:space="0" w:color="000000"/>
             </w:tcBorders>
-            <w:shd w:val="clear" w:color="auto" w:fill="auto"/>
           </w:tcPr>
           <w:p>
             <w:pPr>
@@ -2312,7 +2300,6 @@
               <w:left w:val="single" w:sz="4" w:space="0" w:color="000000"/>
               <w:bottom w:val="single" w:sz="4" w:space="0" w:color="000000"/>
             </w:tcBorders>
-            <w:shd w:val="clear" w:color="auto" w:fill="auto"/>
           </w:tcPr>
           <w:p>
             <w:pPr>
@@ -2337,7 +2324,6 @@
               <w:bottom w:val="single" w:sz="4" w:space="0" w:color="000000"/>
               <w:right w:val="single" w:sz="4" w:space="0" w:color="000000"/>
             </w:tcBorders>
-            <w:shd w:val="clear" w:color="auto" w:fill="auto"/>
           </w:tcPr>
           <w:p>
             <w:pPr>
@@ -2363,7 +2349,6 @@
               <w:left w:val="single" w:sz="4" w:space="0" w:color="000000"/>
               <w:bottom w:val="single" w:sz="4" w:space="0" w:color="000000"/>
             </w:tcBorders>
-            <w:shd w:val="clear" w:color="auto" w:fill="auto"/>
           </w:tcPr>
           <w:p>
             <w:pPr>
@@ -2388,7 +2373,6 @@
               <w:bottom w:val="single" w:sz="4" w:space="0" w:color="000000"/>
               <w:right w:val="single" w:sz="4" w:space="0" w:color="000000"/>
             </w:tcBorders>
-            <w:shd w:val="clear" w:color="auto" w:fill="auto"/>
           </w:tcPr>
           <w:p>
             <w:pPr>
@@ -2477,7 +2461,6 @@
               <w:left w:val="single" w:sz="4" w:space="0" w:color="000000"/>
               <w:bottom w:val="single" w:sz="4" w:space="0" w:color="000000"/>
             </w:tcBorders>
-            <w:shd w:val="clear" w:color="auto" w:fill="auto"/>
           </w:tcPr>
           <w:p>
             <w:pPr>
@@ -2503,7 +2486,6 @@
               <w:left w:val="single" w:sz="4" w:space="0" w:color="000000"/>
               <w:bottom w:val="single" w:sz="4" w:space="0" w:color="000000"/>
             </w:tcBorders>
-            <w:shd w:val="clear" w:color="auto" w:fill="auto"/>
           </w:tcPr>
           <w:p>
             <w:pPr>
@@ -2530,7 +2512,6 @@
               <w:bottom w:val="single" w:sz="4" w:space="0" w:color="000000"/>
               <w:right w:val="single" w:sz="4" w:space="0" w:color="000000"/>
             </w:tcBorders>
-            <w:shd w:val="clear" w:color="auto" w:fill="auto"/>
           </w:tcPr>
           <w:p>
             <w:pPr>
@@ -2668,7 +2649,6 @@
               <w:left w:val="single" w:sz="4" w:space="0" w:color="000000"/>
               <w:bottom w:val="single" w:sz="4" w:space="0" w:color="000000"/>
             </w:tcBorders>
-            <w:shd w:val="clear" w:color="auto" w:fill="auto"/>
           </w:tcPr>
           <w:p>
             <w:pPr>
@@ -2691,7 +2671,6 @@
               <w:left w:val="single" w:sz="4" w:space="0" w:color="000000"/>
               <w:bottom w:val="single" w:sz="4" w:space="0" w:color="000000"/>
             </w:tcBorders>
-            <w:shd w:val="clear" w:color="auto" w:fill="auto"/>
           </w:tcPr>
           <w:p>
             <w:pPr>
@@ -2715,7 +2694,6 @@
               <w:bottom w:val="single" w:sz="4" w:space="0" w:color="000000"/>
               <w:right w:val="single" w:sz="4" w:space="0" w:color="000000"/>
             </w:tcBorders>
-            <w:shd w:val="clear" w:color="auto" w:fill="auto"/>
           </w:tcPr>
           <w:p>
             <w:pPr>
@@ -2740,7 +2718,6 @@
               <w:left w:val="single" w:sz="4" w:space="0" w:color="000000"/>
               <w:bottom w:val="single" w:sz="4" w:space="0" w:color="000000"/>
             </w:tcBorders>
-            <w:shd w:val="clear" w:color="auto" w:fill="auto"/>
           </w:tcPr>
           <w:p>
             <w:pPr>
@@ -2763,7 +2740,6 @@
               <w:left w:val="single" w:sz="4" w:space="0" w:color="000000"/>
               <w:bottom w:val="single" w:sz="4" w:space="0" w:color="000000"/>
             </w:tcBorders>
-            <w:shd w:val="clear" w:color="auto" w:fill="auto"/>
           </w:tcPr>
           <w:p>
             <w:pPr>
@@ -2787,7 +2763,6 @@
               <w:bottom w:val="single" w:sz="4" w:space="0" w:color="000000"/>
               <w:right w:val="single" w:sz="4" w:space="0" w:color="000000"/>
             </w:tcBorders>
-            <w:shd w:val="clear" w:color="auto" w:fill="auto"/>
           </w:tcPr>
           <w:p>
             <w:pPr>
@@ -2812,7 +2787,6 @@
               <w:left w:val="single" w:sz="4" w:space="0" w:color="000000"/>
               <w:bottom w:val="single" w:sz="4" w:space="0" w:color="000000"/>
             </w:tcBorders>
-            <w:shd w:val="clear" w:color="auto" w:fill="auto"/>
           </w:tcPr>
           <w:p>
             <w:pPr>
@@ -2835,7 +2809,6 @@
               <w:left w:val="single" w:sz="4" w:space="0" w:color="000000"/>
               <w:bottom w:val="single" w:sz="4" w:space="0" w:color="000000"/>
             </w:tcBorders>
-            <w:shd w:val="clear" w:color="auto" w:fill="auto"/>
           </w:tcPr>
           <w:p>
             <w:pPr>
@@ -2859,7 +2832,6 @@
               <w:bottom w:val="single" w:sz="4" w:space="0" w:color="000000"/>
               <w:right w:val="single" w:sz="4" w:space="0" w:color="000000"/>
             </w:tcBorders>
-            <w:shd w:val="clear" w:color="auto" w:fill="auto"/>
           </w:tcPr>
           <w:p>
             <w:pPr>
@@ -2928,7 +2900,6 @@
               <w:left w:val="single" w:sz="4" w:space="0" w:color="000000"/>
               <w:bottom w:val="single" w:sz="4" w:space="0" w:color="000000"/>
             </w:tcBorders>
-            <w:shd w:val="clear" w:color="auto" w:fill="auto"/>
           </w:tcPr>
           <w:p>
             <w:pPr>
@@ -2953,7 +2924,6 @@
               <w:left w:val="single" w:sz="4" w:space="0" w:color="000000"/>
               <w:bottom w:val="single" w:sz="4" w:space="0" w:color="000000"/>
             </w:tcBorders>
-            <w:shd w:val="clear" w:color="auto" w:fill="auto"/>
           </w:tcPr>
           <w:p>
             <w:pPr>
@@ -2979,7 +2949,6 @@
               <w:bottom w:val="single" w:sz="4" w:space="0" w:color="000000"/>
               <w:right w:val="single" w:sz="4" w:space="0" w:color="000000"/>
             </w:tcBorders>
-            <w:shd w:val="clear" w:color="auto" w:fill="auto"/>
           </w:tcPr>
           <w:p>
             <w:pPr>
@@ -3006,7 +2975,6 @@
               <w:left w:val="single" w:sz="4" w:space="0" w:color="000000"/>
               <w:bottom w:val="single" w:sz="4" w:space="0" w:color="000000"/>
             </w:tcBorders>
-            <w:shd w:val="clear" w:color="auto" w:fill="auto"/>
           </w:tcPr>
           <w:p>
             <w:pPr>
@@ -3028,7 +2996,6 @@
               <w:left w:val="single" w:sz="4" w:space="0" w:color="000000"/>
               <w:bottom w:val="single" w:sz="4" w:space="0" w:color="000000"/>
             </w:tcBorders>
-            <w:shd w:val="clear" w:color="auto" w:fill="auto"/>
           </w:tcPr>
           <w:p>
             <w:pPr>
@@ -3051,7 +3018,6 @@
               <w:bottom w:val="single" w:sz="4" w:space="0" w:color="000000"/>
               <w:right w:val="single" w:sz="4" w:space="0" w:color="000000"/>
             </w:tcBorders>
-            <w:shd w:val="clear" w:color="auto" w:fill="auto"/>
           </w:tcPr>
           <w:p>
             <w:pPr>
@@ -3074,7 +3040,6 @@
               <w:left w:val="single" w:sz="4" w:space="0" w:color="000000"/>
               <w:bottom w:val="single" w:sz="4" w:space="0" w:color="000000"/>
             </w:tcBorders>
-            <w:shd w:val="clear" w:color="auto" w:fill="auto"/>
           </w:tcPr>
           <w:p>
             <w:pPr>
@@ -3095,7 +3060,6 @@
               <w:left w:val="single" w:sz="4" w:space="0" w:color="000000"/>
               <w:bottom w:val="single" w:sz="4" w:space="0" w:color="000000"/>
             </w:tcBorders>
-            <w:shd w:val="clear" w:color="auto" w:fill="auto"/>
           </w:tcPr>
           <w:p>
             <w:pPr>
@@ -3117,7 +3081,6 @@
               <w:bottom w:val="single" w:sz="4" w:space="0" w:color="000000"/>
               <w:right w:val="single" w:sz="4" w:space="0" w:color="000000"/>
             </w:tcBorders>
-            <w:shd w:val="clear" w:color="auto" w:fill="auto"/>
           </w:tcPr>
           <w:p>
             <w:pPr>
@@ -3141,7 +3104,6 @@
               <w:left w:val="single" w:sz="4" w:space="0" w:color="000000"/>
               <w:bottom w:val="single" w:sz="4" w:space="0" w:color="000000"/>
             </w:tcBorders>
-            <w:shd w:val="clear" w:color="auto" w:fill="auto"/>
           </w:tcPr>
           <w:p>
             <w:pPr>
@@ -3163,7 +3125,6 @@
               <w:left w:val="single" w:sz="4" w:space="0" w:color="000000"/>
               <w:bottom w:val="single" w:sz="4" w:space="0" w:color="000000"/>
             </w:tcBorders>
-            <w:shd w:val="clear" w:color="auto" w:fill="auto"/>
           </w:tcPr>
           <w:p>
             <w:pPr>
@@ -3186,7 +3147,6 @@
               <w:bottom w:val="single" w:sz="4" w:space="0" w:color="000000"/>
               <w:right w:val="single" w:sz="4" w:space="0" w:color="000000"/>
             </w:tcBorders>
-            <w:shd w:val="clear" w:color="auto" w:fill="auto"/>
           </w:tcPr>
           <w:p>
             <w:pPr>
@@ -3263,7 +3223,6 @@
               <w:left w:val="single" w:sz="4" w:space="0" w:color="000000"/>
               <w:bottom w:val="single" w:sz="4" w:space="0" w:color="000000"/>
             </w:tcBorders>
-            <w:shd w:val="clear" w:color="auto" w:fill="auto"/>
           </w:tcPr>
           <w:p>
             <w:pPr>
@@ -3288,7 +3247,6 @@
               <w:left w:val="single" w:sz="4" w:space="0" w:color="000000"/>
               <w:bottom w:val="single" w:sz="4" w:space="0" w:color="000000"/>
             </w:tcBorders>
-            <w:shd w:val="clear" w:color="auto" w:fill="auto"/>
           </w:tcPr>
           <w:p>
             <w:pPr>
@@ -3314,7 +3272,6 @@
               <w:bottom w:val="single" w:sz="4" w:space="0" w:color="000000"/>
               <w:right w:val="single" w:sz="4" w:space="0" w:color="000000"/>
             </w:tcBorders>
-            <w:shd w:val="clear" w:color="auto" w:fill="auto"/>
           </w:tcPr>
           <w:p>
             <w:pPr>
@@ -3341,7 +3298,6 @@
               <w:left w:val="single" w:sz="4" w:space="0" w:color="000000"/>
               <w:bottom w:val="single" w:sz="4" w:space="0" w:color="000000"/>
             </w:tcBorders>
-            <w:shd w:val="clear" w:color="auto" w:fill="auto"/>
           </w:tcPr>
           <w:p>
             <w:pPr>
@@ -3363,7 +3319,6 @@
               <w:left w:val="single" w:sz="4" w:space="0" w:color="000000"/>
               <w:bottom w:val="single" w:sz="4" w:space="0" w:color="000000"/>
             </w:tcBorders>
-            <w:shd w:val="clear" w:color="auto" w:fill="auto"/>
           </w:tcPr>
           <w:p>
             <w:pPr>
@@ -3386,7 +3341,6 @@
               <w:bottom w:val="single" w:sz="4" w:space="0" w:color="000000"/>
               <w:right w:val="single" w:sz="4" w:space="0" w:color="000000"/>
             </w:tcBorders>
-            <w:shd w:val="clear" w:color="auto" w:fill="auto"/>
           </w:tcPr>
           <w:p>
             <w:pPr>
@@ -3410,7 +3364,6 @@
               <w:left w:val="single" w:sz="4" w:space="0" w:color="000000"/>
               <w:bottom w:val="single" w:sz="4" w:space="0" w:color="000000"/>
             </w:tcBorders>
-            <w:shd w:val="clear" w:color="auto" w:fill="auto"/>
           </w:tcPr>
           <w:p>
             <w:pPr>
@@ -3432,7 +3385,6 @@
               <w:left w:val="single" w:sz="4" w:space="0" w:color="000000"/>
               <w:bottom w:val="single" w:sz="4" w:space="0" w:color="000000"/>
             </w:tcBorders>
-            <w:shd w:val="clear" w:color="auto" w:fill="auto"/>
           </w:tcPr>
           <w:p>
             <w:pPr>
@@ -3455,7 +3407,6 @@
               <w:bottom w:val="single" w:sz="4" w:space="0" w:color="000000"/>
               <w:right w:val="single" w:sz="4" w:space="0" w:color="000000"/>
             </w:tcBorders>
-            <w:shd w:val="clear" w:color="auto" w:fill="auto"/>
           </w:tcPr>
           <w:p>
             <w:pPr>
@@ -3479,7 +3430,6 @@
               <w:left w:val="single" w:sz="4" w:space="0" w:color="000000"/>
               <w:bottom w:val="single" w:sz="4" w:space="0" w:color="000000"/>
             </w:tcBorders>
-            <w:shd w:val="clear" w:color="auto" w:fill="auto"/>
           </w:tcPr>
           <w:p>
             <w:pPr>
@@ -3501,7 +3451,6 @@
               <w:left w:val="single" w:sz="4" w:space="0" w:color="000000"/>
               <w:bottom w:val="single" w:sz="4" w:space="0" w:color="000000"/>
             </w:tcBorders>
-            <w:shd w:val="clear" w:color="auto" w:fill="auto"/>
           </w:tcPr>
           <w:p>
             <w:pPr>
@@ -3524,7 +3473,6 @@
               <w:bottom w:val="single" w:sz="4" w:space="0" w:color="000000"/>
               <w:right w:val="single" w:sz="4" w:space="0" w:color="000000"/>
             </w:tcBorders>
-            <w:shd w:val="clear" w:color="auto" w:fill="auto"/>
           </w:tcPr>
           <w:p>
             <w:pPr>
@@ -3547,7 +3495,6 @@
               <w:left w:val="single" w:sz="4" w:space="0" w:color="000000"/>
               <w:bottom w:val="single" w:sz="4" w:space="0" w:color="000000"/>
             </w:tcBorders>
-            <w:shd w:val="clear" w:color="auto" w:fill="auto"/>
           </w:tcPr>
           <w:p>
             <w:pPr>
@@ -3568,7 +3515,6 @@
               <w:left w:val="single" w:sz="4" w:space="0" w:color="000000"/>
               <w:bottom w:val="single" w:sz="4" w:space="0" w:color="000000"/>
             </w:tcBorders>
-            <w:shd w:val="clear" w:color="auto" w:fill="auto"/>
           </w:tcPr>
           <w:p>
             <w:pPr>
@@ -3590,7 +3536,6 @@
               <w:bottom w:val="single" w:sz="4" w:space="0" w:color="000000"/>
               <w:right w:val="single" w:sz="4" w:space="0" w:color="000000"/>
             </w:tcBorders>
-            <w:shd w:val="clear" w:color="auto" w:fill="auto"/>
           </w:tcPr>
           <w:p>
             <w:pPr>
@@ -3777,7 +3722,6 @@
               <w:left w:val="single" w:sz="4" w:space="0" w:color="000000"/>
               <w:bottom w:val="single" w:sz="4" w:space="0" w:color="000000"/>
             </w:tcBorders>
-            <w:shd w:val="clear" w:color="auto" w:fill="auto"/>
           </w:tcPr>
           <w:p>
             <w:pPr>
@@ -3914,7 +3858,6 @@
               <w:bottom w:val="single" w:sz="4" w:space="0" w:color="000000"/>
               <w:right w:val="single" w:sz="4" w:space="0" w:color="000000"/>
             </w:tcBorders>
-            <w:shd w:val="clear" w:color="auto" w:fill="auto"/>
           </w:tcPr>
           <w:p>
             <w:pPr>
@@ -3943,7 +3886,6 @@
               <w:left w:val="single" w:sz="4" w:space="0" w:color="000000"/>
               <w:bottom w:val="single" w:sz="4" w:space="0" w:color="000000"/>
             </w:tcBorders>
-            <w:shd w:val="clear" w:color="auto" w:fill="auto"/>
           </w:tcPr>
           <w:p>
             <w:pPr>
@@ -3968,7 +3910,6 @@
               <w:bottom w:val="single" w:sz="4" w:space="0" w:color="000000"/>
               <w:right w:val="single" w:sz="4" w:space="0" w:color="000000"/>
             </w:tcBorders>
-            <w:shd w:val="clear" w:color="auto" w:fill="auto"/>
           </w:tcPr>
           <w:p>
             <w:pPr>
@@ -3994,7 +3935,6 @@
               <w:left w:val="single" w:sz="4" w:space="0" w:color="000000"/>
               <w:bottom w:val="single" w:sz="4" w:space="0" w:color="000000"/>
             </w:tcBorders>
-            <w:shd w:val="clear" w:color="auto" w:fill="auto"/>
           </w:tcPr>
           <w:p>
             <w:pPr>
@@ -4019,7 +3959,6 @@
               <w:bottom w:val="single" w:sz="4" w:space="0" w:color="000000"/>
               <w:right w:val="single" w:sz="4" w:space="0" w:color="000000"/>
             </w:tcBorders>
-            <w:shd w:val="clear" w:color="auto" w:fill="auto"/>
           </w:tcPr>
           <w:p>
             <w:pPr>
@@ -4045,7 +3984,6 @@
               <w:left w:val="single" w:sz="4" w:space="0" w:color="000000"/>
               <w:bottom w:val="single" w:sz="4" w:space="0" w:color="000000"/>
             </w:tcBorders>
-            <w:shd w:val="clear" w:color="auto" w:fill="auto"/>
           </w:tcPr>
           <w:p>
             <w:pPr>
@@ -4070,7 +4008,6 @@
               <w:bottom w:val="single" w:sz="4" w:space="0" w:color="000000"/>
               <w:right w:val="single" w:sz="4" w:space="0" w:color="000000"/>
             </w:tcBorders>
-            <w:shd w:val="clear" w:color="auto" w:fill="auto"/>
           </w:tcPr>
           <w:p>
             <w:pPr>
@@ -4223,7 +4160,6 @@
               <w:left w:val="single" w:sz="4" w:space="0" w:color="000000"/>
               <w:bottom w:val="single" w:sz="4" w:space="0" w:color="000000"/>
             </w:tcBorders>
-            <w:shd w:val="clear" w:color="auto" w:fill="auto"/>
           </w:tcPr>
           <w:p>
             <w:pPr>
@@ -4249,7 +4185,6 @@
               <w:left w:val="single" w:sz="4" w:space="0" w:color="000000"/>
               <w:bottom w:val="single" w:sz="4" w:space="0" w:color="000000"/>
             </w:tcBorders>
-            <w:shd w:val="clear" w:color="auto" w:fill="auto"/>
           </w:tcPr>
           <w:p>
             <w:pPr>
@@ -4276,7 +4211,6 @@
               <w:bottom w:val="single" w:sz="4" w:space="0" w:color="000000"/>
               <w:right w:val="single" w:sz="4" w:space="0" w:color="000000"/>
             </w:tcBorders>
-            <w:shd w:val="clear" w:color="auto" w:fill="auto"/>
           </w:tcPr>
           <w:p>
             <w:pPr>
@@ -4414,7 +4348,6 @@
               <w:left w:val="single" w:sz="4" w:space="0" w:color="000000"/>
               <w:bottom w:val="single" w:sz="4" w:space="0" w:color="000000"/>
             </w:tcBorders>
-            <w:shd w:val="clear" w:color="auto" w:fill="auto"/>
           </w:tcPr>
           <w:p>
             <w:pPr>
@@ -4437,7 +4370,6 @@
               <w:left w:val="single" w:sz="4" w:space="0" w:color="000000"/>
               <w:bottom w:val="single" w:sz="4" w:space="0" w:color="000000"/>
             </w:tcBorders>
-            <w:shd w:val="clear" w:color="auto" w:fill="auto"/>
           </w:tcPr>
           <w:p>
             <w:pPr>
@@ -4461,7 +4393,6 @@
               <w:bottom w:val="single" w:sz="4" w:space="0" w:color="000000"/>
               <w:right w:val="single" w:sz="4" w:space="0" w:color="000000"/>
             </w:tcBorders>
-            <w:shd w:val="clear" w:color="auto" w:fill="auto"/>
           </w:tcPr>
           <w:p>
             <w:pPr>
@@ -4486,7 +4417,6 @@
               <w:left w:val="single" w:sz="4" w:space="0" w:color="000000"/>
               <w:bottom w:val="single" w:sz="4" w:space="0" w:color="000000"/>
             </w:tcBorders>
-            <w:shd w:val="clear" w:color="auto" w:fill="auto"/>
           </w:tcPr>
           <w:p>
             <w:pPr>
@@ -4509,7 +4439,6 @@
               <w:left w:val="single" w:sz="4" w:space="0" w:color="000000"/>
               <w:bottom w:val="single" w:sz="4" w:space="0" w:color="000000"/>
             </w:tcBorders>
-            <w:shd w:val="clear" w:color="auto" w:fill="auto"/>
           </w:tcPr>
           <w:p>
             <w:pPr>
@@ -4533,7 +4462,6 @@
               <w:bottom w:val="single" w:sz="4" w:space="0" w:color="000000"/>
               <w:right w:val="single" w:sz="4" w:space="0" w:color="000000"/>
             </w:tcBorders>
-            <w:shd w:val="clear" w:color="auto" w:fill="auto"/>
           </w:tcPr>
           <w:p>
             <w:pPr>
@@ -4653,7 +4581,6 @@
               <w:left w:val="single" w:sz="4" w:space="0" w:color="000000"/>
               <w:bottom w:val="single" w:sz="4" w:space="0" w:color="000000"/>
             </w:tcBorders>
-            <w:shd w:val="clear" w:color="auto" w:fill="auto"/>
           </w:tcPr>
           <w:p>
             <w:pPr>
@@ -4680,7 +4607,6 @@
               <w:bottom w:val="single" w:sz="4" w:space="0" w:color="000000"/>
               <w:right w:val="single" w:sz="4" w:space="0" w:color="000000"/>
             </w:tcBorders>
-            <w:shd w:val="clear" w:color="auto" w:fill="auto"/>
           </w:tcPr>
           <w:p>
             <w:pPr>
@@ -4708,7 +4634,6 @@
               <w:left w:val="single" w:sz="4" w:space="0" w:color="000000"/>
               <w:bottom w:val="single" w:sz="4" w:space="0" w:color="000000"/>
             </w:tcBorders>
-            <w:shd w:val="clear" w:color="auto" w:fill="auto"/>
           </w:tcPr>
           <w:p>
             <w:pPr>
@@ -4732,7 +4657,6 @@
               <w:bottom w:val="single" w:sz="4" w:space="0" w:color="000000"/>
               <w:right w:val="single" w:sz="4" w:space="0" w:color="000000"/>
             </w:tcBorders>
-            <w:shd w:val="clear" w:color="auto" w:fill="auto"/>
           </w:tcPr>
           <w:p>
             <w:pPr>
@@ -4756,7 +4680,6 @@
               <w:left w:val="single" w:sz="4" w:space="0" w:color="000000"/>
               <w:bottom w:val="single" w:sz="4" w:space="0" w:color="000000"/>
             </w:tcBorders>
-            <w:shd w:val="clear" w:color="auto" w:fill="auto"/>
           </w:tcPr>
           <w:p>
             <w:pPr>
@@ -4779,7 +4702,6 @@
               <w:bottom w:val="single" w:sz="4" w:space="0" w:color="000000"/>
               <w:right w:val="single" w:sz="4" w:space="0" w:color="000000"/>
             </w:tcBorders>
-            <w:shd w:val="clear" w:color="auto" w:fill="auto"/>
           </w:tcPr>
           <w:p>
             <w:pPr>
@@ -4804,7 +4726,6 @@
               <w:left w:val="single" w:sz="4" w:space="0" w:color="000000"/>
               <w:bottom w:val="single" w:sz="4" w:space="0" w:color="000000"/>
             </w:tcBorders>
-            <w:shd w:val="clear" w:color="auto" w:fill="auto"/>
           </w:tcPr>
           <w:p>
             <w:pPr>
@@ -4828,7 +4749,6 @@
               <w:bottom w:val="single" w:sz="4" w:space="0" w:color="000000"/>
               <w:right w:val="single" w:sz="4" w:space="0" w:color="000000"/>
             </w:tcBorders>
-            <w:shd w:val="clear" w:color="auto" w:fill="auto"/>
           </w:tcPr>
           <w:p>
             <w:pPr>
@@ -4959,7 +4879,6 @@
               <w:left w:val="single" w:sz="4" w:space="0" w:color="000000"/>
               <w:bottom w:val="single" w:sz="4" w:space="0" w:color="000000"/>
             </w:tcBorders>
-            <w:shd w:val="clear" w:color="auto" w:fill="auto"/>
           </w:tcPr>
           <w:p>
             <w:pPr>
@@ -4986,7 +4905,6 @@
               <w:bottom w:val="single" w:sz="4" w:space="0" w:color="000000"/>
               <w:right w:val="single" w:sz="4" w:space="0" w:color="000000"/>
             </w:tcBorders>
-            <w:shd w:val="clear" w:color="auto" w:fill="auto"/>
           </w:tcPr>
           <w:p>
             <w:pPr>
@@ -5124,7 +5042,6 @@
               <w:left w:val="single" w:sz="4" w:space="0" w:color="000000"/>
               <w:bottom w:val="single" w:sz="4" w:space="0" w:color="000000"/>
             </w:tcBorders>
-            <w:shd w:val="clear" w:color="auto" w:fill="auto"/>
           </w:tcPr>
           <w:p>
             <w:pPr>
@@ -5148,7 +5065,6 @@
               <w:bottom w:val="single" w:sz="4" w:space="0" w:color="000000"/>
               <w:right w:val="single" w:sz="4" w:space="0" w:color="000000"/>
             </w:tcBorders>
-            <w:shd w:val="clear" w:color="auto" w:fill="auto"/>
           </w:tcPr>
           <w:p>
             <w:pPr>
@@ -5172,7 +5088,6 @@
               <w:left w:val="single" w:sz="4" w:space="0" w:color="000000"/>
               <w:bottom w:val="single" w:sz="4" w:space="0" w:color="000000"/>
             </w:tcBorders>
-            <w:shd w:val="clear" w:color="auto" w:fill="auto"/>
           </w:tcPr>
           <w:p>
             <w:pPr>
@@ -5195,7 +5110,6 @@
               <w:bottom w:val="single" w:sz="4" w:space="0" w:color="000000"/>
               <w:right w:val="single" w:sz="4" w:space="0" w:color="000000"/>
             </w:tcBorders>
-            <w:shd w:val="clear" w:color="auto" w:fill="auto"/>
           </w:tcPr>
           <w:p>
             <w:pPr>
@@ -5220,7 +5134,6 @@
               <w:left w:val="single" w:sz="4" w:space="0" w:color="000000"/>
               <w:bottom w:val="single" w:sz="4" w:space="0" w:color="000000"/>
             </w:tcBorders>
-            <w:shd w:val="clear" w:color="auto" w:fill="auto"/>
           </w:tcPr>
           <w:p>
             <w:pPr>
@@ -5244,7 +5157,6 @@
               <w:bottom w:val="single" w:sz="4" w:space="0" w:color="000000"/>
               <w:right w:val="single" w:sz="4" w:space="0" w:color="000000"/>
             </w:tcBorders>
-            <w:shd w:val="clear" w:color="auto" w:fill="auto"/>
           </w:tcPr>
           <w:p>
             <w:pPr>
@@ -5367,7 +5279,6 @@
               <w:left w:val="single" w:sz="4" w:space="0" w:color="000000"/>
               <w:bottom w:val="single" w:sz="4" w:space="0" w:color="000000"/>
             </w:tcBorders>
-            <w:shd w:val="clear" w:color="auto" w:fill="auto"/>
           </w:tcPr>
           <w:p>
             <w:pPr>
@@ -5394,7 +5305,6 @@
               <w:bottom w:val="single" w:sz="4" w:space="0" w:color="000000"/>
               <w:right w:val="single" w:sz="4" w:space="0" w:color="000000"/>
             </w:tcBorders>
-            <w:shd w:val="clear" w:color="auto" w:fill="auto"/>
           </w:tcPr>
           <w:p>
             <w:pPr>
@@ -5532,7 +5442,6 @@
               <w:left w:val="single" w:sz="4" w:space="0" w:color="000000"/>
               <w:bottom w:val="single" w:sz="4" w:space="0" w:color="000000"/>
             </w:tcBorders>
-            <w:shd w:val="clear" w:color="auto" w:fill="auto"/>
           </w:tcPr>
           <w:p>
             <w:pPr>
@@ -5556,7 +5465,6 @@
               <w:bottom w:val="single" w:sz="4" w:space="0" w:color="000000"/>
               <w:right w:val="single" w:sz="4" w:space="0" w:color="000000"/>
             </w:tcBorders>
-            <w:shd w:val="clear" w:color="auto" w:fill="auto"/>
           </w:tcPr>
           <w:p>
             <w:pPr>
@@ -5580,7 +5488,6 @@
               <w:left w:val="single" w:sz="4" w:space="0" w:color="000000"/>
               <w:bottom w:val="single" w:sz="4" w:space="0" w:color="000000"/>
             </w:tcBorders>
-            <w:shd w:val="clear" w:color="auto" w:fill="auto"/>
           </w:tcPr>
           <w:p>
             <w:pPr>
@@ -5603,7 +5510,6 @@
               <w:bottom w:val="single" w:sz="4" w:space="0" w:color="000000"/>
               <w:right w:val="single" w:sz="4" w:space="0" w:color="000000"/>
             </w:tcBorders>
-            <w:shd w:val="clear" w:color="auto" w:fill="auto"/>
           </w:tcPr>
           <w:p>
             <w:pPr>
@@ -5628,7 +5534,6 @@
               <w:left w:val="single" w:sz="4" w:space="0" w:color="000000"/>
               <w:bottom w:val="single" w:sz="4" w:space="0" w:color="000000"/>
             </w:tcBorders>
-            <w:shd w:val="clear" w:color="auto" w:fill="auto"/>
           </w:tcPr>
           <w:p>
             <w:pPr>
@@ -5652,7 +5557,6 @@
               <w:bottom w:val="single" w:sz="4" w:space="0" w:color="000000"/>
               <w:right w:val="single" w:sz="4" w:space="0" w:color="000000"/>
             </w:tcBorders>
-            <w:shd w:val="clear" w:color="auto" w:fill="auto"/>
           </w:tcPr>
           <w:p>
             <w:pPr>
@@ -5720,7 +5624,6 @@
               <w:left w:val="single" w:sz="4" w:space="0" w:color="00000A"/>
               <w:bottom w:val="single" w:sz="4" w:space="0" w:color="00000A"/>
             </w:tcBorders>
-            <w:shd w:val="clear" w:color="auto" w:fill="auto"/>
           </w:tcPr>
           <w:p>
             <w:pPr>
@@ -5746,7 +5649,6 @@
               <w:left w:val="single" w:sz="4" w:space="0" w:color="00000A"/>
               <w:bottom w:val="single" w:sz="4" w:space="0" w:color="00000A"/>
             </w:tcBorders>
-            <w:shd w:val="clear" w:color="auto" w:fill="auto"/>
           </w:tcPr>
           <w:p>
             <w:pPr>
@@ -5773,7 +5675,6 @@
               <w:bottom w:val="single" w:sz="4" w:space="0" w:color="00000A"/>
               <w:right w:val="single" w:sz="4" w:space="0" w:color="00000A"/>
             </w:tcBorders>
-            <w:shd w:val="clear" w:color="auto" w:fill="auto"/>
           </w:tcPr>
           <w:p>
             <w:pPr>
@@ -5909,7 +5810,6 @@
               <w:left w:val="single" w:sz="4" w:space="0" w:color="00000A"/>
               <w:bottom w:val="single" w:sz="4" w:space="0" w:color="00000A"/>
             </w:tcBorders>
-            <w:shd w:val="clear" w:color="auto" w:fill="auto"/>
           </w:tcPr>
           <w:p>
             <w:pPr>
@@ -5932,7 +5832,6 @@
               <w:left w:val="single" w:sz="4" w:space="0" w:color="00000A"/>
               <w:bottom w:val="single" w:sz="4" w:space="0" w:color="00000A"/>
             </w:tcBorders>
-            <w:shd w:val="clear" w:color="auto" w:fill="auto"/>
           </w:tcPr>
           <w:p>
             <w:pPr>
@@ -5956,7 +5855,6 @@
               <w:bottom w:val="single" w:sz="4" w:space="0" w:color="00000A"/>
               <w:right w:val="single" w:sz="4" w:space="0" w:color="00000A"/>
             </w:tcBorders>
-            <w:shd w:val="clear" w:color="auto" w:fill="auto"/>
           </w:tcPr>
           <w:p>
             <w:pPr>
@@ -5981,7 +5879,6 @@
               <w:left w:val="single" w:sz="4" w:space="0" w:color="00000A"/>
               <w:bottom w:val="single" w:sz="4" w:space="0" w:color="00000A"/>
             </w:tcBorders>
-            <w:shd w:val="clear" w:color="auto" w:fill="auto"/>
           </w:tcPr>
           <w:p>
             <w:pPr>
@@ -6004,7 +5901,6 @@
               <w:left w:val="single" w:sz="4" w:space="0" w:color="00000A"/>
               <w:bottom w:val="single" w:sz="4" w:space="0" w:color="00000A"/>
             </w:tcBorders>
-            <w:shd w:val="clear" w:color="auto" w:fill="auto"/>
           </w:tcPr>
           <w:p>
             <w:pPr>
@@ -6028,7 +5924,6 @@
               <w:bottom w:val="single" w:sz="4" w:space="0" w:color="00000A"/>
               <w:right w:val="single" w:sz="4" w:space="0" w:color="00000A"/>
             </w:tcBorders>
-            <w:shd w:val="clear" w:color="auto" w:fill="auto"/>
           </w:tcPr>
           <w:p>
             <w:pPr>
@@ -6053,7 +5948,6 @@
               <w:left w:val="single" w:sz="4" w:space="0" w:color="00000A"/>
               <w:bottom w:val="single" w:sz="4" w:space="0" w:color="00000A"/>
             </w:tcBorders>
-            <w:shd w:val="clear" w:color="auto" w:fill="auto"/>
           </w:tcPr>
           <w:p>
             <w:pPr>
@@ -6076,7 +5970,6 @@
               <w:left w:val="single" w:sz="4" w:space="0" w:color="00000A"/>
               <w:bottom w:val="single" w:sz="4" w:space="0" w:color="00000A"/>
             </w:tcBorders>
-            <w:shd w:val="clear" w:color="auto" w:fill="auto"/>
           </w:tcPr>
           <w:p>
             <w:pPr>
@@ -6100,7 +5993,6 @@
               <w:bottom w:val="single" w:sz="4" w:space="0" w:color="00000A"/>
               <w:right w:val="single" w:sz="4" w:space="0" w:color="00000A"/>
             </w:tcBorders>
-            <w:shd w:val="clear" w:color="auto" w:fill="auto"/>
           </w:tcPr>
           <w:p>
             <w:pPr>
@@ -6268,7 +6160,6 @@
               <w:left w:val="single" w:sz="4" w:space="0" w:color="000000"/>
               <w:bottom w:val="single" w:sz="4" w:space="0" w:color="000000"/>
             </w:tcBorders>
-            <w:shd w:val="clear" w:color="auto" w:fill="auto"/>
           </w:tcPr>
           <w:p>
             <w:pPr>
@@ -6293,7 +6184,6 @@
               <w:left w:val="single" w:sz="4" w:space="0" w:color="000000"/>
               <w:bottom w:val="single" w:sz="4" w:space="0" w:color="000000"/>
             </w:tcBorders>
-            <w:shd w:val="clear" w:color="auto" w:fill="auto"/>
           </w:tcPr>
           <w:p>
             <w:pPr>
@@ -6426,7 +6316,6 @@
               <w:left w:val="single" w:sz="4" w:space="0" w:color="000000"/>
               <w:bottom w:val="single" w:sz="4" w:space="0" w:color="000000"/>
             </w:tcBorders>
-            <w:shd w:val="clear" w:color="auto" w:fill="auto"/>
           </w:tcPr>
           <w:p>
             <w:pPr>
@@ -6452,7 +6341,6 @@
               <w:bottom w:val="single" w:sz="4" w:space="0" w:color="000000"/>
               <w:right w:val="single" w:sz="4" w:space="0" w:color="000000"/>
             </w:tcBorders>
-            <w:shd w:val="clear" w:color="auto" w:fill="auto"/>
           </w:tcPr>
           <w:p>
             <w:pPr>
@@ -6479,7 +6367,6 @@
               <w:left w:val="single" w:sz="4" w:space="0" w:color="000000"/>
               <w:bottom w:val="single" w:sz="4" w:space="0" w:color="000000"/>
             </w:tcBorders>
-            <w:shd w:val="clear" w:color="auto" w:fill="auto"/>
           </w:tcPr>
           <w:p>
             <w:pPr>
@@ -6503,7 +6390,6 @@
               <w:left w:val="single" w:sz="4" w:space="0" w:color="000000"/>
               <w:bottom w:val="single" w:sz="4" w:space="0" w:color="000000"/>
             </w:tcBorders>
-            <w:shd w:val="clear" w:color="auto" w:fill="auto"/>
           </w:tcPr>
           <w:p>
             <w:pPr>
@@ -6527,7 +6413,6 @@
               <w:left w:val="single" w:sz="4" w:space="0" w:color="000000"/>
               <w:bottom w:val="single" w:sz="4" w:space="0" w:color="000000"/>
             </w:tcBorders>
-            <w:shd w:val="clear" w:color="auto" w:fill="auto"/>
           </w:tcPr>
           <w:p>
             <w:pPr>
@@ -6552,7 +6437,6 @@
               <w:bottom w:val="single" w:sz="4" w:space="0" w:color="000000"/>
               <w:right w:val="single" w:sz="4" w:space="0" w:color="000000"/>
             </w:tcBorders>
-            <w:shd w:val="clear" w:color="auto" w:fill="auto"/>
           </w:tcPr>
           <w:p>
             <w:pPr>
@@ -6578,7 +6462,6 @@
               <w:left w:val="single" w:sz="4" w:space="0" w:color="000000"/>
               <w:bottom w:val="single" w:sz="4" w:space="0" w:color="000000"/>
             </w:tcBorders>
-            <w:shd w:val="clear" w:color="auto" w:fill="auto"/>
           </w:tcPr>
           <w:p>
             <w:pPr>
@@ -6602,7 +6485,6 @@
               <w:left w:val="single" w:sz="4" w:space="0" w:color="000000"/>
               <w:bottom w:val="single" w:sz="4" w:space="0" w:color="000000"/>
             </w:tcBorders>
-            <w:shd w:val="clear" w:color="auto" w:fill="auto"/>
           </w:tcPr>
           <w:p>
             <w:pPr>
@@ -6626,7 +6508,6 @@
               <w:left w:val="single" w:sz="4" w:space="0" w:color="000000"/>
               <w:bottom w:val="single" w:sz="4" w:space="0" w:color="000000"/>
             </w:tcBorders>
-            <w:shd w:val="clear" w:color="auto" w:fill="auto"/>
           </w:tcPr>
           <w:p>
             <w:pPr>
@@ -6651,7 +6532,6 @@
               <w:bottom w:val="single" w:sz="4" w:space="0" w:color="000000"/>
               <w:right w:val="single" w:sz="4" w:space="0" w:color="000000"/>
             </w:tcBorders>
-            <w:shd w:val="clear" w:color="auto" w:fill="auto"/>
           </w:tcPr>
           <w:p>
             <w:pPr>
@@ -6676,7 +6556,6 @@
               <w:left w:val="single" w:sz="4" w:space="0" w:color="000000"/>
               <w:bottom w:val="single" w:sz="4" w:space="0" w:color="000000"/>
             </w:tcBorders>
-            <w:shd w:val="clear" w:color="auto" w:fill="auto"/>
           </w:tcPr>
           <w:p>
             <w:pPr>
@@ -6699,7 +6578,6 @@
               <w:left w:val="single" w:sz="4" w:space="0" w:color="000000"/>
               <w:bottom w:val="single" w:sz="4" w:space="0" w:color="000000"/>
             </w:tcBorders>
-            <w:shd w:val="clear" w:color="auto" w:fill="auto"/>
           </w:tcPr>
           <w:p>
             <w:pPr>
@@ -6722,7 +6600,6 @@
               <w:left w:val="single" w:sz="4" w:space="0" w:color="000000"/>
               <w:bottom w:val="single" w:sz="4" w:space="0" w:color="000000"/>
             </w:tcBorders>
-            <w:shd w:val="clear" w:color="auto" w:fill="auto"/>
           </w:tcPr>
           <w:p>
             <w:pPr>
@@ -6746,7 +6623,6 @@
               <w:bottom w:val="single" w:sz="4" w:space="0" w:color="000000"/>
               <w:right w:val="single" w:sz="4" w:space="0" w:color="000000"/>
             </w:tcBorders>
-            <w:shd w:val="clear" w:color="auto" w:fill="auto"/>
           </w:tcPr>
           <w:p>
             <w:pPr>
@@ -6772,7 +6648,6 @@
               <w:left w:val="single" w:sz="4" w:space="0" w:color="000000"/>
               <w:bottom w:val="single" w:sz="4" w:space="0" w:color="000000"/>
             </w:tcBorders>
-            <w:shd w:val="clear" w:color="auto" w:fill="auto"/>
           </w:tcPr>
           <w:p>
             <w:pPr>
@@ -6796,7 +6671,6 @@
               <w:left w:val="single" w:sz="4" w:space="0" w:color="000000"/>
               <w:bottom w:val="single" w:sz="4" w:space="0" w:color="000000"/>
             </w:tcBorders>
-            <w:shd w:val="clear" w:color="auto" w:fill="auto"/>
           </w:tcPr>
           <w:p>
             <w:pPr>
@@ -6820,7 +6694,6 @@
               <w:left w:val="single" w:sz="4" w:space="0" w:color="000000"/>
               <w:bottom w:val="single" w:sz="4" w:space="0" w:color="000000"/>
             </w:tcBorders>
-            <w:shd w:val="clear" w:color="auto" w:fill="auto"/>
           </w:tcPr>
           <w:p>
             <w:pPr>
@@ -6845,7 +6718,6 @@
               <w:bottom w:val="single" w:sz="4" w:space="0" w:color="000000"/>
               <w:right w:val="single" w:sz="4" w:space="0" w:color="000000"/>
             </w:tcBorders>
-            <w:shd w:val="clear" w:color="auto" w:fill="auto"/>
           </w:tcPr>
           <w:p>
             <w:pPr>
@@ -7029,7 +6901,6 @@
               <w:left w:val="single" w:sz="4" w:space="0" w:color="000000"/>
               <w:bottom w:val="single" w:sz="4" w:space="0" w:color="000000"/>
             </w:tcBorders>
-            <w:shd w:val="clear" w:color="auto" w:fill="auto"/>
           </w:tcPr>
           <w:p>
             <w:pPr>
@@ -7055,7 +6926,6 @@
               <w:left w:val="single" w:sz="4" w:space="0" w:color="000000"/>
               <w:bottom w:val="single" w:sz="4" w:space="0" w:color="000000"/>
             </w:tcBorders>
-            <w:shd w:val="clear" w:color="auto" w:fill="auto"/>
           </w:tcPr>
           <w:p>
             <w:pPr>
@@ -7082,7 +6952,6 @@
               <w:bottom w:val="single" w:sz="4" w:space="0" w:color="000000"/>
               <w:right w:val="single" w:sz="4" w:space="0" w:color="000000"/>
             </w:tcBorders>
-            <w:shd w:val="clear" w:color="auto" w:fill="auto"/>
           </w:tcPr>
           <w:p>
             <w:pPr>
@@ -7110,7 +6979,6 @@
               <w:left w:val="single" w:sz="4" w:space="0" w:color="000000"/>
               <w:bottom w:val="single" w:sz="4" w:space="0" w:color="000000"/>
             </w:tcBorders>
-            <w:shd w:val="clear" w:color="auto" w:fill="auto"/>
           </w:tcPr>
           <w:p>
             <w:pPr>
@@ -7134,7 +7002,6 @@
               <w:left w:val="single" w:sz="4" w:space="0" w:color="000000"/>
               <w:bottom w:val="single" w:sz="4" w:space="0" w:color="000000"/>
             </w:tcBorders>
-            <w:shd w:val="clear" w:color="auto" w:fill="auto"/>
           </w:tcPr>
           <w:p>
             <w:pPr>
@@ -7159,7 +7026,6 @@
               <w:bottom w:val="single" w:sz="4" w:space="0" w:color="000000"/>
               <w:right w:val="single" w:sz="4" w:space="0" w:color="000000"/>
             </w:tcBorders>
-            <w:shd w:val="clear" w:color="auto" w:fill="auto"/>
           </w:tcPr>
           <w:p>
             <w:pPr>
@@ -7296,7 +7162,6 @@
               <w:left w:val="single" w:sz="4" w:space="0" w:color="000000"/>
               <w:bottom w:val="single" w:sz="4" w:space="0" w:color="000000"/>
             </w:tcBorders>
-            <w:shd w:val="clear" w:color="auto" w:fill="auto"/>
           </w:tcPr>
           <w:p>
             <w:pPr>
@@ -7322,7 +7187,6 @@
               <w:left w:val="single" w:sz="4" w:space="0" w:color="000000"/>
               <w:bottom w:val="single" w:sz="4" w:space="0" w:color="000000"/>
             </w:tcBorders>
-            <w:shd w:val="clear" w:color="auto" w:fill="auto"/>
           </w:tcPr>
           <w:p>
             <w:pPr>
@@ -7349,7 +7213,6 @@
               <w:bottom w:val="single" w:sz="4" w:space="0" w:color="000000"/>
               <w:right w:val="single" w:sz="4" w:space="0" w:color="000000"/>
             </w:tcBorders>
-            <w:shd w:val="clear" w:color="auto" w:fill="auto"/>
           </w:tcPr>
           <w:p>
             <w:pPr>
@@ -7377,7 +7240,6 @@
               <w:left w:val="single" w:sz="4" w:space="0" w:color="000000"/>
               <w:bottom w:val="single" w:sz="4" w:space="0" w:color="000000"/>
             </w:tcBorders>
-            <w:shd w:val="clear" w:color="auto" w:fill="auto"/>
           </w:tcPr>
           <w:p>
             <w:pPr>
@@ -7401,7 +7263,6 @@
               <w:left w:val="single" w:sz="4" w:space="0" w:color="000000"/>
               <w:bottom w:val="single" w:sz="4" w:space="0" w:color="000000"/>
             </w:tcBorders>
-            <w:shd w:val="clear" w:color="auto" w:fill="auto"/>
           </w:tcPr>
           <w:p>
             <w:pPr>
@@ -7426,7 +7287,6 @@
               <w:bottom w:val="single" w:sz="4" w:space="0" w:color="000000"/>
               <w:right w:val="single" w:sz="4" w:space="0" w:color="000000"/>
             </w:tcBorders>
-            <w:shd w:val="clear" w:color="auto" w:fill="auto"/>
           </w:tcPr>
           <w:p>
             <w:pPr>
@@ -7554,7 +7414,6 @@
               <w:left w:val="single" w:sz="4" w:space="0" w:color="000000"/>
               <w:bottom w:val="single" w:sz="4" w:space="0" w:color="000000"/>
             </w:tcBorders>
-            <w:shd w:val="clear" w:color="auto" w:fill="auto"/>
           </w:tcPr>
           <w:p>
             <w:pPr>
@@ -7581,7 +7440,6 @@
               <w:left w:val="single" w:sz="4" w:space="0" w:color="000000"/>
               <w:bottom w:val="single" w:sz="4" w:space="0" w:color="000000"/>
             </w:tcBorders>
-            <w:shd w:val="clear" w:color="auto" w:fill="auto"/>
           </w:tcPr>
           <w:p>
             <w:pPr>
@@ -7608,7 +7466,6 @@
               <w:left w:val="single" w:sz="4" w:space="0" w:color="000000"/>
               <w:bottom w:val="single" w:sz="4" w:space="0" w:color="000000"/>
             </w:tcBorders>
-            <w:shd w:val="clear" w:color="auto" w:fill="auto"/>
           </w:tcPr>
           <w:p>
             <w:pPr>
@@ -7636,7 +7493,6 @@
               <w:bottom w:val="single" w:sz="4" w:space="0" w:color="000000"/>
               <w:right w:val="single" w:sz="4" w:space="0" w:color="000000"/>
             </w:tcBorders>
-            <w:shd w:val="clear" w:color="auto" w:fill="auto"/>
           </w:tcPr>
           <w:p>
             <w:pPr>
@@ -7665,7 +7521,6 @@
               <w:left w:val="single" w:sz="4" w:space="0" w:color="000000"/>
               <w:bottom w:val="single" w:sz="4" w:space="0" w:color="000000"/>
             </w:tcBorders>
-            <w:shd w:val="clear" w:color="auto" w:fill="auto"/>
           </w:tcPr>
           <w:p>
             <w:pPr>
@@ -7689,7 +7544,6 @@
               <w:left w:val="single" w:sz="4" w:space="0" w:color="000000"/>
               <w:bottom w:val="single" w:sz="4" w:space="0" w:color="000000"/>
             </w:tcBorders>
-            <w:shd w:val="clear" w:color="auto" w:fill="auto"/>
           </w:tcPr>
           <w:p>
             <w:pPr>
@@ -7713,7 +7567,6 @@
               <w:left w:val="single" w:sz="4" w:space="0" w:color="000000"/>
               <w:bottom w:val="single" w:sz="4" w:space="0" w:color="000000"/>
             </w:tcBorders>
-            <w:shd w:val="clear" w:color="auto" w:fill="auto"/>
           </w:tcPr>
           <w:p>
             <w:pPr>
@@ -7738,7 +7591,6 @@
               <w:bottom w:val="single" w:sz="4" w:space="0" w:color="000000"/>
               <w:right w:val="single" w:sz="4" w:space="0" w:color="000000"/>
             </w:tcBorders>
-            <w:shd w:val="clear" w:color="auto" w:fill="auto"/>
           </w:tcPr>
           <w:p>
             <w:pPr>
@@ -7764,7 +7616,6 @@
               <w:left w:val="single" w:sz="4" w:space="0" w:color="000000"/>
               <w:bottom w:val="single" w:sz="4" w:space="0" w:color="000000"/>
             </w:tcBorders>
-            <w:shd w:val="clear" w:color="auto" w:fill="auto"/>
           </w:tcPr>
           <w:p>
             <w:pPr>
@@ -7788,7 +7639,6 @@
               <w:left w:val="single" w:sz="4" w:space="0" w:color="000000"/>
               <w:bottom w:val="single" w:sz="4" w:space="0" w:color="000000"/>
             </w:tcBorders>
-            <w:shd w:val="clear" w:color="auto" w:fill="auto"/>
           </w:tcPr>
           <w:p>
             <w:pPr>
@@ -7812,7 +7662,6 @@
               <w:left w:val="single" w:sz="4" w:space="0" w:color="000000"/>
               <w:bottom w:val="single" w:sz="4" w:space="0" w:color="000000"/>
             </w:tcBorders>
-            <w:shd w:val="clear" w:color="auto" w:fill="auto"/>
           </w:tcPr>
           <w:p>
             <w:pPr>
@@ -7837,7 +7686,6 @@
               <w:bottom w:val="single" w:sz="4" w:space="0" w:color="000000"/>
               <w:right w:val="single" w:sz="4" w:space="0" w:color="000000"/>
             </w:tcBorders>
-            <w:shd w:val="clear" w:color="auto" w:fill="auto"/>
           </w:tcPr>
           <w:p>
             <w:pPr>
@@ -7915,7 +7763,6 @@
               <w:left w:val="single" w:sz="4" w:space="0" w:color="000000"/>
               <w:bottom w:val="single" w:sz="4" w:space="0" w:color="000000"/>
             </w:tcBorders>
-            <w:shd w:val="clear" w:color="auto" w:fill="auto"/>
           </w:tcPr>
           <w:p>
             <w:pPr>
@@ -7942,7 +7789,6 @@
               <w:left w:val="single" w:sz="4" w:space="0" w:color="000000"/>
               <w:bottom w:val="single" w:sz="4" w:space="0" w:color="000000"/>
             </w:tcBorders>
-            <w:shd w:val="clear" w:color="auto" w:fill="auto"/>
           </w:tcPr>
           <w:p>
             <w:pPr>
@@ -7970,7 +7816,6 @@
               <w:bottom w:val="single" w:sz="4" w:space="0" w:color="000000"/>
               <w:right w:val="single" w:sz="4" w:space="0" w:color="000000"/>
             </w:tcBorders>
-            <w:shd w:val="clear" w:color="auto" w:fill="auto"/>
           </w:tcPr>
           <w:p>
             <w:pPr>
@@ -7999,7 +7844,6 @@
               <w:left w:val="single" w:sz="4" w:space="0" w:color="000000"/>
               <w:bottom w:val="single" w:sz="4" w:space="0" w:color="000000"/>
             </w:tcBorders>
-            <w:shd w:val="clear" w:color="auto" w:fill="auto"/>
           </w:tcPr>
           <w:p>
             <w:pPr>
@@ -8023,7 +7867,6 @@
               <w:left w:val="single" w:sz="4" w:space="0" w:color="000000"/>
               <w:bottom w:val="single" w:sz="4" w:space="0" w:color="000000"/>
             </w:tcBorders>
-            <w:shd w:val="clear" w:color="auto" w:fill="auto"/>
           </w:tcPr>
           <w:p>
             <w:pPr>
@@ -8048,7 +7891,6 @@
               <w:bottom w:val="single" w:sz="4" w:space="0" w:color="000000"/>
               <w:right w:val="single" w:sz="4" w:space="0" w:color="000000"/>
             </w:tcBorders>
-            <w:shd w:val="clear" w:color="auto" w:fill="auto"/>
           </w:tcPr>
           <w:p>
             <w:pPr>
@@ -8074,7 +7916,6 @@
               <w:left w:val="single" w:sz="4" w:space="0" w:color="000000"/>
               <w:bottom w:val="single" w:sz="4" w:space="0" w:color="000000"/>
             </w:tcBorders>
-            <w:shd w:val="clear" w:color="auto" w:fill="auto"/>
           </w:tcPr>
           <w:p>
             <w:pPr>
@@ -8098,7 +7939,6 @@
               <w:left w:val="single" w:sz="4" w:space="0" w:color="000000"/>
               <w:bottom w:val="single" w:sz="4" w:space="0" w:color="000000"/>
             </w:tcBorders>
-            <w:shd w:val="clear" w:color="auto" w:fill="auto"/>
           </w:tcPr>
           <w:p>
             <w:pPr>
@@ -8123,7 +7963,6 @@
               <w:bottom w:val="single" w:sz="4" w:space="0" w:color="000000"/>
               <w:right w:val="single" w:sz="4" w:space="0" w:color="000000"/>
             </w:tcBorders>
-            <w:shd w:val="clear" w:color="auto" w:fill="auto"/>
           </w:tcPr>
           <w:p>
             <w:pPr>
@@ -8319,7 +8158,6 @@
               <w:bottom w:val="single" w:sz="4" w:space="0" w:color="000000"/>
               <w:right w:val="single" w:sz="4" w:space="0" w:color="000000"/>
             </w:tcBorders>
-            <w:shd w:val="clear" w:color="auto" w:fill="auto"/>
           </w:tcPr>
           <w:p>
             <w:pPr>

</xml_diff>